<commit_message>
feat: implementar sistema de agendamiento con calendario y arquitectura modular de formularios
- se agregan componentes de calendario para crear, editar y ver agendamientos por ficha y aprendiz
- se integran formularios modulares para aprendiz, empresa, ficha, documentos, observaciones, usuarios y reportes GFPIF
- se implementan hooks personalizados para operaciones CRUD, sincronización y manejo de estado
- se crean contextos globales para alertas, usuarios, sidebar, notificaciones, paginación y filtros de datos
- se reestructuran páginas con flujos separados para aprendiz, instructor y administrador
- se actualizan controladores, rutas y modelos del backend para soportar agendamientos y lógica de reportes
- se mejoran estilos y temas con nuevos componentes reutilizables
- se actualizan .gitignore y configuración de eslint para mantenimiento del proyecto
</commit_message>
<xml_diff>
--- a/server/templates/PlantillaGFPI_F_023.docx
+++ b/server/templates/PlantillaGFPI_F_023.docx
@@ -1115,6 +1115,54 @@
             </w:tcBorders>
             <w:vAlign w:val="center"/>
           </w:tcPr>
+          <w:p>
+            <w:pPr>
+              <w:suppressAutoHyphens/>
+              <w:rPr>
+                <w:rFonts w:ascii="Calibri" w:hAnsi="Calibri" w:cs="Calibri"/>
+                <w:bCs/>
+                <w:color w:val="000000"/>
+                <w:spacing w:val="-3"/>
+                <w:sz w:val="18"/>
+                <w:szCs w:val="18"/>
+              </w:rPr>
+            </w:pPr>
+            <w:r>
+              <w:rPr>
+                <w:rFonts w:ascii="Calibri" w:hAnsi="Calibri" w:cs="Calibri"/>
+                <w:bCs/>
+                <w:color w:val="000000"/>
+                <w:spacing w:val="-3"/>
+                <w:sz w:val="18"/>
+                <w:szCs w:val="18"/>
+              </w:rPr>
+              <w:t>{</w:t>
+            </w:r>
+            <w:proofErr w:type="spellStart"/>
+            <w:r>
+              <w:rPr>
+                <w:rFonts w:ascii="Calibri" w:hAnsi="Calibri" w:cs="Calibri"/>
+                <w:bCs/>
+                <w:color w:val="000000"/>
+                <w:spacing w:val="-3"/>
+                <w:sz w:val="18"/>
+                <w:szCs w:val="18"/>
+              </w:rPr>
+              <w:t>AlternativaAprendiz</w:t>
+            </w:r>
+            <w:proofErr w:type="spellEnd"/>
+            <w:r>
+              <w:rPr>
+                <w:rFonts w:ascii="Calibri" w:hAnsi="Calibri" w:cs="Calibri"/>
+                <w:bCs/>
+                <w:color w:val="000000"/>
+                <w:spacing w:val="-3"/>
+                <w:sz w:val="18"/>
+                <w:szCs w:val="18"/>
+              </w:rPr>
+              <w:t>}</w:t>
+            </w:r>
+          </w:p>
           <w:p>
             <w:pPr>
               <w:suppressAutoHyphens/>
@@ -11016,7 +11064,6 @@
   <w:style w:type="character" w:default="1" w:styleId="DefaultParagraphFont">
     <w:name w:val="Default Paragraph Font"/>
     <w:uiPriority w:val="1"/>
-    <w:semiHidden/>
     <w:unhideWhenUsed/>
   </w:style>
   <w:style w:type="table" w:default="1" w:styleId="TableNormal">

</xml_diff>